<commit_message>
Atualizando e adicionando revisão
</commit_message>
<xml_diff>
--- a/CulturaDigitalEContemporanea/Avaliacao/TerceiroTrimestre/Avaliacao/AvaliacaoCulturaDigital3anoSegundoTrimestre2025.docx
+++ b/CulturaDigitalEContemporanea/Avaliacao/TerceiroTrimestre/Avaliacao/AvaliacaoCulturaDigital3anoSegundoTrimestre2025.docx
@@ -83,7 +83,7 @@
               </wp:anchor>
             </w:drawing>
           </mc:Choice>
-          <mc:Fallback xmlns:w16sdtdh="http://schemas.microsoft.com/office/word/2020/wordml/sdtdatahash" xmlns:w16="http://schemas.microsoft.com/office/word/2018/wordml" xmlns:w16cid="http://schemas.microsoft.com/office/word/2016/wordml/cid" xmlns:w16cex="http://schemas.microsoft.com/office/word/2018/wordml/cex" xmlns:a="http://schemas.openxmlformats.org/drawingml/2006/main">
+          <mc:Fallback xmlns:a="http://schemas.openxmlformats.org/drawingml/2006/main" xmlns:w16cex="http://schemas.microsoft.com/office/word/2018/wordml/cex" xmlns:w16cid="http://schemas.microsoft.com/office/word/2016/wordml/cid" xmlns:w16="http://schemas.microsoft.com/office/word/2018/wordml" xmlns:w16sdtdh="http://schemas.microsoft.com/office/word/2020/wordml/sdtdatahash">
             <w:pict>
               <v:shapetype id="_x0000_t75" coordsize="21600,21600" o:spt="75" o:preferrelative="t" path="m@4@5l@4@11@9@11@9@5xe" filled="f" stroked="f">
                 <v:stroke joinstyle="miter"/>
@@ -174,7 +174,7 @@
               </wp:anchor>
             </w:drawing>
           </mc:Choice>
-          <mc:Fallback xmlns:w16sdtdh="http://schemas.microsoft.com/office/word/2020/wordml/sdtdatahash" xmlns:w16="http://schemas.microsoft.com/office/word/2018/wordml" xmlns:w16cid="http://schemas.microsoft.com/office/word/2016/wordml/cid" xmlns:w16cex="http://schemas.microsoft.com/office/word/2018/wordml/cex" xmlns:a="http://schemas.openxmlformats.org/drawingml/2006/main">
+          <mc:Fallback xmlns:a="http://schemas.openxmlformats.org/drawingml/2006/main" xmlns:w16cex="http://schemas.microsoft.com/office/word/2018/wordml/cex" xmlns:w16cid="http://schemas.microsoft.com/office/word/2016/wordml/cid" xmlns:w16="http://schemas.microsoft.com/office/word/2018/wordml" xmlns:w16sdtdh="http://schemas.microsoft.com/office/word/2020/wordml/sdtdatahash">
             <w:pict>
               <v:shapetype id="_x0000_t75" coordsize="21600,21600" o:spt="75" o:preferrelative="t" path="m@4@5l@4@11@9@11@9@5xe" filled="f" stroked="f">
                 <v:stroke joinstyle="miter"/>
@@ -280,7 +280,7 @@
               </wp:anchor>
             </w:drawing>
           </mc:Choice>
-          <mc:Fallback xmlns:w16sdtdh="http://schemas.microsoft.com/office/word/2020/wordml/sdtdatahash" xmlns:w16="http://schemas.microsoft.com/office/word/2018/wordml" xmlns:w16cid="http://schemas.microsoft.com/office/word/2016/wordml/cid" xmlns:w16cex="http://schemas.microsoft.com/office/word/2018/wordml/cex" xmlns:a="http://schemas.openxmlformats.org/drawingml/2006/main">
+          <mc:Fallback xmlns:a="http://schemas.openxmlformats.org/drawingml/2006/main" xmlns:w16cex="http://schemas.microsoft.com/office/word/2018/wordml/cex" xmlns:w16cid="http://schemas.microsoft.com/office/word/2016/wordml/cid" xmlns:w16="http://schemas.microsoft.com/office/word/2018/wordml" xmlns:w16sdtdh="http://schemas.microsoft.com/office/word/2020/wordml/sdtdatahash">
             <w:pict>
               <v:shapetype id="_x0000_t75" coordsize="21600,21600" o:spt="75" o:preferrelative="t" path="m@4@5l@4@11@9@11@9@5xe" filled="f" stroked="f">
                 <v:stroke joinstyle="miter"/>
@@ -467,7 +467,23 @@
           <w:rFonts w:ascii="Times New Roman" w:hAnsi="Times New Roman" w:cs="Times New Roman"/>
           <w:highlight w:val="yellow"/>
         </w:rPr>
-        <w:t xml:space="preserve">AVALIAÇÃO DE CULTURA DIGITAL E COMTEMPORÂNEA - </w:t>
+        <w:t>AV</w:t>
+      </w:r>
+      <w:r>
+        <w:rPr>
+          <w:rFonts w:ascii="Times New Roman" w:hAnsi="Times New Roman" w:cs="Times New Roman"/>
+          <w:highlight w:val="yellow"/>
+        </w:rPr>
+        <w:t>ALIAÇÃO DE CULTURA DIGITAL E CON</w:t>
+      </w:r>
+      <w:bookmarkStart w:id="0" w:name="_GoBack"/>
+      <w:bookmarkEnd w:id="0"/>
+      <w:r>
+        <w:rPr>
+          <w:rFonts w:ascii="Times New Roman" w:hAnsi="Times New Roman" w:cs="Times New Roman"/>
+          <w:highlight w:val="yellow"/>
+        </w:rPr>
+        <w:t xml:space="preserve">TEMPORÂNEA - </w:t>
       </w:r>
       <w:r>
         <w:rPr>
@@ -514,8 +530,6 @@
           <w:highlight w:val="yellow"/>
         </w:rPr>
       </w:pPr>
-      <w:bookmarkStart w:id="0" w:name="_GoBack"/>
-      <w:bookmarkEnd w:id="0"/>
     </w:p>
     <w:p>
       <w:pPr>
@@ -15676,7 +15690,7 @@
 </file>
 
 <file path=customXml/itemProps1.xml><?xml version="1.0" encoding="utf-8"?>
-<ds:datastoreItem xmlns:ds="http://schemas.openxmlformats.org/officeDocument/2006/customXml" ds:itemID="{DD76F651-7A3D-47B6-B165-8591E1EF5DCC}">
+<ds:datastoreItem xmlns:ds="http://schemas.openxmlformats.org/officeDocument/2006/customXml" ds:itemID="{5156FA94-1392-4171-8389-D7CF5FCBC19D}">
   <ds:schemaRefs>
     <ds:schemaRef ds:uri="http://schemas.openxmlformats.org/officeDocument/2006/bibliography"/>
   </ds:schemaRefs>

</xml_diff>